<commit_message>
v5.25.0: lista de matéria-prima atualizada pelo Nomus (manual e automática) e baixa automática da Lista de cadastro
Co-Authored-By: Claude Sonnet 5.5 <noreply@anthropic.com>
Claude-Session: https://claude.ai/code/session_019C5pL3tAQSfZCPA82KGQYq
</commit_message>
<xml_diff>
--- a/docs/manual/MINC_ServiceHub_Manual_Administrador.docx
+++ b/docs/manual/MINC_ServiceHub_Manual_Administrador.docx
@@ -1762,7 +1762,7 @@
                 <w:i w:val="0"/>
                 <w:sz w:val="19"/>
               </w:rPr>
-              <w:t>(quando ligado) Preenche pedido, cliente e equipamento a partir do pedido ou da ordem do Nomus.</w:t>
+              <w:t>(quando ligado) Digite o pedido, a ordem ou o processo do jeito que vier: PD307, PD 00307, PD.307, OS 307, OS.307, proc 307 ou só 307. Use % para pular partes (PD%307, %2025%). Se houver vários resultados, toque no que você quer. Preenche pedido, cliente e equipamento (ou a ordem, ou o nº do processo).</w:t>
             </w:r>
           </w:p>
         </w:tc>
@@ -2205,6 +2205,43 @@
                 <w:sz w:val="19"/>
               </w:rPr>
               <w:t>Marque os serviços da lista oficial (com código do Nomus).</w:t>
+            </w:r>
+          </w:p>
+        </w:tc>
+      </w:tr>
+      <w:tr>
+        <w:trPr>
+          <w:cantSplit/>
+        </w:trPr>
+        <w:tc>
+          <w:tcPr>
+            <w:tcW w:type="dxa" w:w="2948"/>
+          </w:tcPr>
+          <w:p>
+            <w:r>
+              <w:rPr>
+                <w:rFonts w:ascii="Arial" w:hAnsi="Arial" w:eastAsia="Arial"/>
+                <w:b/>
+                <w:i w:val="0"/>
+                <w:sz w:val="19"/>
+              </w:rPr>
+              <w:t>Item sem cadastro que já foi cadastrado</w:t>
+            </w:r>
+          </w:p>
+        </w:tc>
+        <w:tc>
+          <w:tcPr>
+            <w:tcW w:type="dxa" w:w="6917"/>
+          </w:tcPr>
+          <w:p>
+            <w:r>
+              <w:rPr>
+                <w:rFonts w:ascii="Arial" w:hAnsi="Arial" w:eastAsia="Arial"/>
+                <w:b w:val="0"/>
+                <w:i w:val="0"/>
+                <w:sz w:val="19"/>
+              </w:rPr>
+              <w:t>Depois que a engenharia cadastra o item no Nomus, o app atualiza a lista e liga o código ao item sozinho (quando a descrição é idêntica) ou pede a confirmação do gestor. O item sai da Lista de cadastro.</w:t>
             </w:r>
           </w:p>
         </w:tc>
@@ -5144,7 +5181,44 @@
                 <w:i w:val="0"/>
                 <w:sz w:val="19"/>
               </w:rPr>
-              <w:t>Importar a planilha do Nomus (prévia antes de gravar), adicionar, editar, desativar e exportar.</w:t>
+              <w:t>Importar a planilha do Nomus (prévia antes de gravar), adicionar, editar, desativar e exportar. “Atualizar pelo Nomus” lê os produtos do Nomus, mostra a prévia (novos, alterados, a desativar) e aplica; com a opção ligada, a lista também se atualiza sozinha 1 vez por dia.</w:t>
+            </w:r>
+          </w:p>
+        </w:tc>
+      </w:tr>
+      <w:tr>
+        <w:trPr>
+          <w:cantSplit/>
+        </w:trPr>
+        <w:tc>
+          <w:tcPr>
+            <w:tcW w:type="dxa" w:w="2948"/>
+          </w:tcPr>
+          <w:p>
+            <w:r>
+              <w:rPr>
+                <w:rFonts w:ascii="Arial" w:hAnsi="Arial" w:eastAsia="Arial"/>
+                <w:b/>
+                <w:i w:val="0"/>
+                <w:sz w:val="19"/>
+              </w:rPr>
+              <w:t>Verificar cadastros novos</w:t>
+            </w:r>
+          </w:p>
+        </w:tc>
+        <w:tc>
+          <w:tcPr>
+            <w:tcW w:type="dxa" w:w="6917"/>
+          </w:tcPr>
+          <w:p>
+            <w:r>
+              <w:rPr>
+                <w:rFonts w:ascii="Arial" w:hAnsi="Arial" w:eastAsia="Arial"/>
+                <w:b w:val="0"/>
+                <w:i w:val="0"/>
+                <w:sz w:val="19"/>
+              </w:rPr>
+              <w:t>No Painel e na Lista de cadastro: mostra os itens sem cadastro que já existem no Nomus. “Igual” = mesma descrição; “Parecido” = mesmos números e medidas, e você confirma. “Vincular todos os iguais” faz tudo de uma vez.</w:t>
             </w:r>
           </w:p>
         </w:tc>

</xml_diff>

<commit_message>
v5.26.0: processo do CRM do Nomus (etapa, prazo, anexos), avisos de prazo, painel de prazos, Levar ao Nomus (D.E e RTS) e Excel da solicitação de cadastro
Co-Authored-By: Claude Sonnet 5.5 <noreply@anthropic.com>
Claude-Session: https://claude.ai/code/session_019C5pL3tAQSfZCPA82KGQYq
</commit_message>
<xml_diff>
--- a/docs/manual/MINC_ServiceHub_Manual_Administrador.docx
+++ b/docs/manual/MINC_ServiceHub_Manual_Administrador.docx
@@ -1762,7 +1762,44 @@
                 <w:i w:val="0"/>
                 <w:sz w:val="19"/>
               </w:rPr>
-              <w:t>(quando ligado) Digite o pedido, a ordem ou o processo do jeito que vier: PD307, PD 00307, PD.307, OS 307, OS.307, proc 307 ou só 307. Use % para pular partes (PD%307, %2025%). Se houver vários resultados, toque no que você quer. Preenche pedido, cliente e equipamento (ou a ordem, ou o nº do processo).</w:t>
+              <w:t>(quando ligado) Digite o pedido, a ordem ou o processo do jeito que vier: PD307, PD 00307, PD.307, OS 307, OS.307, proc 307 ou só 307. Use % para pular partes (PD%307, %2025%). Se houver vários resultados, toque no que você quer. Preenche pedido, cliente e equipamento (ou a ordem, ou o processo, com pedido e ordem tirados do nome dele).</w:t>
+            </w:r>
+          </w:p>
+        </w:tc>
+      </w:tr>
+      <w:tr>
+        <w:trPr>
+          <w:cantSplit/>
+        </w:trPr>
+        <w:tc>
+          <w:tcPr>
+            <w:tcW w:type="dxa" w:w="2948"/>
+          </w:tcPr>
+          <w:p>
+            <w:r>
+              <w:rPr>
+                <w:rFonts w:ascii="Arial" w:hAnsi="Arial" w:eastAsia="Arial"/>
+                <w:b/>
+                <w:i w:val="0"/>
+                <w:sz w:val="19"/>
+              </w:rPr>
+              <w:t>Processo no Nomus</w:t>
+            </w:r>
+          </w:p>
+        </w:tc>
+        <w:tc>
+          <w:tcPr>
+            <w:tcW w:type="dxa" w:w="6917"/>
+          </w:tcPr>
+          <w:p>
+            <w:r>
+              <w:rPr>
+                <w:rFonts w:ascii="Arial" w:hAnsi="Arial" w:eastAsia="Arial"/>
+                <w:b w:val="0"/>
+                <w:i w:val="0"/>
+                <w:sz w:val="19"/>
+              </w:rPr>
+              <w:t>(quando ligado) Com o nº do processo do CRM no campo Processo (ex.: #1173), aparece uma caixa com etapa, responsável, prioridade, prazo (verde, amarelo ou vermelho) e os arquivos já anexados ao processo no Nomus, com selos “D.E já anexado” e “RTS já anexado”. Atualizar consulta de novo. Abrir no Nomus abre o processo em outra aba.</w:t>
             </w:r>
           </w:p>
         </w:tc>
@@ -2821,6 +2858,43 @@
                 <w:sz w:val="19"/>
               </w:rPr>
               <w:t>Gera o PDF e guarda na nuvem como nova versão (as anteriores ficam no histórico como “Substituída”).</w:t>
+            </w:r>
+          </w:p>
+        </w:tc>
+      </w:tr>
+      <w:tr>
+        <w:trPr>
+          <w:cantSplit/>
+        </w:trPr>
+        <w:tc>
+          <w:tcPr>
+            <w:tcW w:type="dxa" w:w="2948"/>
+          </w:tcPr>
+          <w:p>
+            <w:r>
+              <w:rPr>
+                <w:rFonts w:ascii="Arial" w:hAnsi="Arial" w:eastAsia="Arial"/>
+                <w:b/>
+                <w:i w:val="0"/>
+                <w:sz w:val="19"/>
+              </w:rPr>
+              <w:t>Levar ao Nomus</w:t>
+            </w:r>
+          </w:p>
+        </w:tc>
+        <w:tc>
+          <w:tcPr>
+            <w:tcW w:type="dxa" w:w="6917"/>
+          </w:tcPr>
+          <w:p>
+            <w:r>
+              <w:rPr>
+                <w:rFonts w:ascii="Arial" w:hAnsi="Arial" w:eastAsia="Arial"/>
+                <w:b w:val="0"/>
+                <w:i w:val="0"/>
+                <w:sz w:val="19"/>
+              </w:rPr>
+              <w:t>(quando ligado) Gera o PDF da D.E com o nome padrão (DE - # 1173 PD 00199 …), arquiva a versão, baixa o arquivo e abre o Nomus. No processo, toque em Arquivos anexos › Anexar arquivo e escolha o arquivo baixado. O mesmo botão existe no RTS (pede o nº do processo). O envio direto não é possível: o Nomus não oferece isso na API.</w:t>
             </w:r>
           </w:p>
         </w:tc>

</xml_diff>

<commit_message>
v5.26.1: modelo em Excel da Solicitação de cadastro (Nomus), exportação do app no mesmo layout e manuais atualizados
Co-Authored-By: Claude Sonnet 5.5 <noreply@anthropic.com>
Claude-Session: https://claude.ai/code/session_019C5pL3tAQSfZCPA82KGQYq
</commit_message>
<xml_diff>
--- a/docs/manual/MINC_ServiceHub_Manual_Administrador.docx
+++ b/docs/manual/MINC_ServiceHub_Manual_Administrador.docx
@@ -3237,6 +3237,43 @@
                 <w:i w:val="0"/>
                 <w:sz w:val="19"/>
               </w:rPr>
+              <w:t>Excel da solicitação</w:t>
+            </w:r>
+          </w:p>
+        </w:tc>
+        <w:tc>
+          <w:tcPr>
+            <w:tcW w:type="dxa" w:w="6917"/>
+          </w:tcPr>
+          <w:p>
+            <w:r>
+              <w:rPr>
+                <w:rFonts w:ascii="Arial" w:hAnsi="Arial" w:eastAsia="Arial"/>
+                <w:b w:val="0"/>
+                <w:i w:val="0"/>
+                <w:sz w:val="19"/>
+              </w:rPr>
+              <w:t>Na Lista de cadastro: gera a planilha “SOLICITAÇÃO DE CADASTRO DE PRODUTO — NOMUS” já preenchida (processo, pedido, ordem, equipamento, cliente, solicitante, data e os itens com família, descrição, ficha, unidade, quantidade e item da estrutura). As colunas da direita ficam para a engenharia preencher: código no Nomus, cadastrado por, data e situação (Pendente / Cadastrado / Recusado). Envie a planilha à engenharia; quando o item for cadastrado e a lista do app se atualizar, ele sai sozinho da Lista de cadastro.</w:t>
+            </w:r>
+          </w:p>
+        </w:tc>
+      </w:tr>
+      <w:tr>
+        <w:trPr>
+          <w:cantSplit/>
+        </w:trPr>
+        <w:tc>
+          <w:tcPr>
+            <w:tcW w:type="dxa" w:w="2948"/>
+          </w:tcPr>
+          <w:p>
+            <w:r>
+              <w:rPr>
+                <w:rFonts w:ascii="Arial" w:hAnsi="Arial" w:eastAsia="Arial"/>
+                <w:b/>
+                <w:i w:val="0"/>
+                <w:sz w:val="19"/>
+              </w:rPr>
               <w:t>+ Componente / Subcomponente</w:t>
             </w:r>
           </w:p>

</xml_diff>